<commit_message>
Mkt Diagnostic & PP
</commit_message>
<xml_diff>
--- a/AI-Marketing-Diagnostic-RNLMKT-IT.docx
+++ b/AI-Marketing-Diagnostic-RNLMKT-IT.docx
@@ -49,7 +49,7 @@
     </w:p>
     <w:p>
       <w:pPr>
-        <w:spacing w:after="0"/>
+        <w:spacing w:after="200"/>
       </w:pPr>
       <w:r>
         <w:rPr>
@@ -58,13 +58,8 @@
           <w:sz w:val="42"/>
           <w:szCs w:val="42"/>
         </w:rPr>
-        <w:t xml:space="preserve">In 10 domande</w:t>
+        <w:t xml:space="preserve">Una </w:t>
       </w:r>
-    </w:p>
-    <w:p>
-      <w:pPr>
-        <w:spacing w:after="200"/>
-      </w:pPr>
       <w:r>
         <w:rPr>
           <w:rFonts w:ascii="DM Serif Display" w:cs="DM Serif Display" w:eastAsia="DM Serif Display" w:hAnsi="DM Serif Display"/>
@@ -72,7 +67,16 @@
           <w:sz w:val="42"/>
           <w:szCs w:val="42"/>
         </w:rPr>
-        <w:t xml:space="preserve">AI Marketing Diagnostic</w:t>
+        <w:t xml:space="preserve">Diagnostica di marketing sull'IA</w:t>
+      </w:r>
+      <w:r>
+        <w:rPr>
+          <w:rFonts w:ascii="DM Serif Display" w:cs="DM Serif Display" w:eastAsia="DM Serif Display" w:hAnsi="DM Serif Display"/>
+          <w:color w:val="111111"/>
+          <w:sz w:val="42"/>
+          <w:szCs w:val="42"/>
+        </w:rPr>
+        <w:t xml:space="preserve"> in 10 domande</w:t>
       </w:r>
     </w:p>
     <w:p>
@@ -86,21 +90,7 @@
           <w:sz w:val="20"/>
           <w:szCs w:val="20"/>
         </w:rPr>
-        <w:t xml:space="preserve">Ecco come l'AI sta davvero funzionando (e non funzionando) dentro il tuo team marketing. Questo audit di cinque minuti ti dà chiarezza su come stanno le cose: quali strumenti usa il tuo team, cosa producono e chi risponde del risultato.</w:t>
-      </w:r>
-    </w:p>
-    <w:p>
-      <w:pPr>
-        <w:spacing w:after="140"/>
-      </w:pPr>
-      <w:r>
-        <w:rPr>
-          <w:rFonts w:ascii="DM Sans" w:cs="DM Sans" w:eastAsia="DM Sans" w:hAnsi="DM Sans"/>
-          <w:color w:val="666666"/>
-          <w:sz w:val="20"/>
-          <w:szCs w:val="20"/>
-        </w:rPr>
-        <w:t xml:space="preserve">Trasforma l'adozione rapida e informale dell'AI del tuo team in un sistema coerente, strutturato e affidabile che continua a far crescere il tuo business.</w:t>
+        <w:t xml:space="preserve">Ecco come l'AI sta davvero funzionando (o non funzionando) all'interno del tuo team marketing. Questo audit di cinque minuti darà chiarezza su come stanno le cose: quali strumenti usa il tuo team, cosa producono e chi risponde del risultato. Trasforma l'adozione rapida e informale dell'AI del tuo team in un sistema coerente, strutturato e affidabile sul quale continua a crescere il tuo business.</w:t>
       </w:r>
     </w:p>
     <w:tbl>
@@ -697,7 +687,7 @@
                       <w:sz w:val="17"/>
                       <w:szCs w:val="17"/>
                     </w:rPr>
-                    <w:t xml:space="preserve">Un elenco condiviso è la cosa meno costosa di questa pagina e quella che sblocca tutto il resto: spesa visibile, output coerente e una risposta chiara quando un cliente ti chiede cosa usi. È anche il punto da cui parte l'AI Act europeo.</w:t>
+                    <w:t xml:space="preserve">Un elenco condiviso è la cosa meno complicata di questa pagina e quella che sblocca tutto il resto: spesa visibile, output coerente e una risposta chiara quando un cliente ti chiede cosa usi. È anche il punto da cui parte l'AI Act europeo.</w:t>
                   </w:r>
                 </w:p>
               </w:tc>
@@ -1362,7 +1352,7 @@
                       <w:sz w:val="21"/>
                       <w:szCs w:val="21"/>
                     </w:rPr>
-                    <w:t xml:space="preserve">Quando qualcuno parla con il tuo chatbot, assistente o agente vocale AI, gli viene detto che si tratta di AI?</w:t>
+                    <w:t xml:space="preserve">Quando qualcuno parla con il tuo chatbot, assistente o agente vocale AI, viene informato che si tratta di AI?</w:t>
                   </w:r>
                 </w:p>
               </w:tc>
@@ -5809,7 +5799,7 @@
             <w:pPr>
               <w:jc w:val="center"/>
             </w:pPr>
-            <w:hyperlink w:history="1" r:id="rId8kd0abe8s_zen2immwgkb">
+            <w:hyperlink w:history="1" r:id="rIdfk5taaljfq5wqm1gzzm7b">
               <w:r>
                 <w:rPr>
                   <w:rFonts w:ascii="DM Sans" w:cs="DM Sans" w:eastAsia="DM Sans" w:hAnsi="DM Sans"/>
@@ -5865,7 +5855,7 @@
         </w:rPr>
         <w:t xml:space="preserve"> · </w:t>
       </w:r>
-      <w:hyperlink w:history="1" r:id="rIds-9dtr8vbe6a28ispc5t_">
+      <w:hyperlink w:history="1" r:id="rIdbyn-r9u-ownlr7xwq2ayx">
         <w:r>
           <w:rPr>
             <w:rFonts w:ascii="DM Sans" w:cs="DM Sans" w:eastAsia="DM Sans" w:hAnsi="DM Sans"/>
@@ -5885,7 +5875,7 @@
         </w:rPr>
         <w:t xml:space="preserve"> · </w:t>
       </w:r>
-      <w:hyperlink w:history="1" r:id="rIdffwd53khtmzqi8vbvtx5f">
+      <w:hyperlink w:history="1" r:id="rIdtjovocm6nwuqidlz1qabt">
         <w:r>
           <w:rPr>
             <w:rFonts w:ascii="DM Sans" w:cs="DM Sans" w:eastAsia="DM Sans" w:hAnsi="DM Sans"/>
@@ -5905,7 +5895,7 @@
         </w:rPr>
         <w:t xml:space="preserve"> · </w:t>
       </w:r>
-      <w:hyperlink w:history="1" r:id="rIda7s7iljddwg_qqlcwycqn">
+      <w:hyperlink w:history="1" r:id="rIdhjgt9371qgqdxls9wbjmh">
         <w:r>
           <w:rPr>
             <w:rFonts w:ascii="DM Sans" w:cs="DM Sans" w:eastAsia="DM Sans" w:hAnsi="DM Sans"/>

</xml_diff>